<commit_message>
Update  Phase 5 document formatting
</commit_message>
<xml_diff>
--- a/Phase 5 - Project Development/Phase 5 - Project Development.docx
+++ b/Phase 5 - Project Development/Phase 5 - Project Development.docx
@@ -6,14 +6,20 @@
       <w:pPr>
         <w:jc w:val="center"/>
         <w:rPr>
-          <w:b/>
-          <w:bCs/>
-        </w:rPr>
-      </w:pPr>
-      <w:r>
-        <w:rPr>
-          <w:b/>
-          <w:bCs/>
+          <w:rFonts w:ascii="Times New Roman" w:hAnsi="Times New Roman" w:cs="Times New Roman"/>
+          <w:b/>
+          <w:bCs/>
+          <w:sz w:val="32"/>
+          <w:szCs w:val="32"/>
+        </w:rPr>
+      </w:pPr>
+      <w:r>
+        <w:rPr>
+          <w:rFonts w:ascii="Times New Roman" w:hAnsi="Times New Roman" w:cs="Times New Roman"/>
+          <w:b/>
+          <w:bCs/>
+          <w:sz w:val="32"/>
+          <w:szCs w:val="32"/>
         </w:rPr>
         <w:t>Phase 5 – Project Development</w:t>
       </w:r>
@@ -21,11 +27,19 @@
     <w:p>
       <w:pPr>
         <w:jc w:val="center"/>
-      </w:pPr>
-      <w:r>
-        <w:rPr>
-          <w:b/>
-          <w:bCs/>
+        <w:rPr>
+          <w:rFonts w:ascii="Times New Roman" w:hAnsi="Times New Roman" w:cs="Times New Roman"/>
+          <w:sz w:val="32"/>
+          <w:szCs w:val="32"/>
+        </w:rPr>
+      </w:pPr>
+      <w:r>
+        <w:rPr>
+          <w:rFonts w:ascii="Times New Roman" w:hAnsi="Times New Roman" w:cs="Times New Roman"/>
+          <w:b/>
+          <w:bCs/>
+          <w:sz w:val="32"/>
+          <w:szCs w:val="32"/>
         </w:rPr>
         <w:t>Script-Controlled ACL – Restrict Record Access Based on Field Value</w:t>
       </w:r>
@@ -33,84 +47,138 @@
     <w:p>
       <w:pPr>
         <w:rPr>
-          <w:b/>
-          <w:bCs/>
-        </w:rPr>
-      </w:pPr>
-      <w:r>
-        <w:rPr>
-          <w:b/>
-          <w:bCs/>
+          <w:rFonts w:ascii="Times New Roman" w:hAnsi="Times New Roman" w:cs="Times New Roman"/>
+          <w:b/>
+          <w:bCs/>
+          <w:sz w:val="28"/>
+          <w:szCs w:val="28"/>
+        </w:rPr>
+      </w:pPr>
+      <w:r>
+        <w:rPr>
+          <w:rFonts w:ascii="Times New Roman" w:hAnsi="Times New Roman" w:cs="Times New Roman"/>
+          <w:b/>
+          <w:bCs/>
+          <w:sz w:val="28"/>
+          <w:szCs w:val="28"/>
         </w:rPr>
         <w:t>1. User Creation</w:t>
       </w:r>
     </w:p>
     <w:p>
-      <w:r>
+      <w:pPr>
+        <w:rPr>
+          <w:rFonts w:ascii="Times New Roman" w:hAnsi="Times New Roman" w:cs="Times New Roman"/>
+        </w:rPr>
+      </w:pPr>
+      <w:r>
+        <w:rPr>
+          <w:rFonts w:ascii="Times New Roman" w:hAnsi="Times New Roman" w:cs="Times New Roman"/>
+        </w:rPr>
         <w:t>A test user was created in ServiceNow.</w:t>
       </w:r>
     </w:p>
     <w:p>
-      <w:r>
-        <w:rPr>
+      <w:pPr>
+        <w:rPr>
+          <w:rFonts w:ascii="Times New Roman" w:hAnsi="Times New Roman" w:cs="Times New Roman"/>
+        </w:rPr>
+      </w:pPr>
+      <w:r>
+        <w:rPr>
+          <w:rFonts w:ascii="Times New Roman" w:hAnsi="Times New Roman" w:cs="Times New Roman"/>
           <w:b/>
           <w:bCs/>
         </w:rPr>
         <w:t>User ID:</w:t>
       </w:r>
       <w:r>
+        <w:rPr>
+          <w:rFonts w:ascii="Times New Roman" w:hAnsi="Times New Roman" w:cs="Times New Roman"/>
+        </w:rPr>
         <w:t xml:space="preserve"> EEE User</w:t>
       </w:r>
       <w:r>
+        <w:rPr>
+          <w:rFonts w:ascii="Times New Roman" w:hAnsi="Times New Roman" w:cs="Times New Roman"/>
+        </w:rPr>
         <w:br/>
       </w:r>
       <w:r>
         <w:rPr>
+          <w:rFonts w:ascii="Times New Roman" w:hAnsi="Times New Roman" w:cs="Times New Roman"/>
           <w:b/>
           <w:bCs/>
         </w:rPr>
         <w:t>First Name:</w:t>
       </w:r>
       <w:r>
+        <w:rPr>
+          <w:rFonts w:ascii="Times New Roman" w:hAnsi="Times New Roman" w:cs="Times New Roman"/>
+        </w:rPr>
         <w:t xml:space="preserve"> EEE</w:t>
       </w:r>
       <w:r>
+        <w:rPr>
+          <w:rFonts w:ascii="Times New Roman" w:hAnsi="Times New Roman" w:cs="Times New Roman"/>
+        </w:rPr>
         <w:br/>
       </w:r>
       <w:r>
         <w:rPr>
+          <w:rFonts w:ascii="Times New Roman" w:hAnsi="Times New Roman" w:cs="Times New Roman"/>
           <w:b/>
           <w:bCs/>
         </w:rPr>
         <w:t>Last Name:</w:t>
       </w:r>
       <w:r>
+        <w:rPr>
+          <w:rFonts w:ascii="Times New Roman" w:hAnsi="Times New Roman" w:cs="Times New Roman"/>
+        </w:rPr>
         <w:t xml:space="preserve"> User</w:t>
       </w:r>
       <w:r>
+        <w:rPr>
+          <w:rFonts w:ascii="Times New Roman" w:hAnsi="Times New Roman" w:cs="Times New Roman"/>
+        </w:rPr>
         <w:br/>
       </w:r>
       <w:r>
         <w:rPr>
+          <w:rFonts w:ascii="Times New Roman" w:hAnsi="Times New Roman" w:cs="Times New Roman"/>
           <w:b/>
           <w:bCs/>
         </w:rPr>
         <w:t>Email:</w:t>
       </w:r>
       <w:r>
+        <w:rPr>
+          <w:rFonts w:ascii="Times New Roman" w:hAnsi="Times New Roman" w:cs="Times New Roman"/>
+        </w:rPr>
         <w:t xml:space="preserve"> </w:t>
       </w:r>
       <w:hyperlink r:id="rId5" w:history="1">
         <w:r>
           <w:rPr>
             <w:rStyle w:val="Hyperlink"/>
+            <w:rFonts w:ascii="Times New Roman" w:hAnsi="Times New Roman" w:cs="Times New Roman"/>
           </w:rPr>
           <w:t>eeeuser@gmail.com</w:t>
         </w:r>
       </w:hyperlink>
     </w:p>
     <w:p>
-      <w:r>
+      <w:pPr>
+        <w:rPr>
+          <w:rFonts w:ascii="Times New Roman" w:hAnsi="Times New Roman" w:cs="Times New Roman"/>
+        </w:rPr>
+      </w:pPr>
+      <w:r>
+        <w:rPr>
+          <w:rFonts w:ascii="Times New Roman" w:hAnsi="Times New Roman" w:cs="Times New Roman"/>
+          <w:noProof/>
+        </w:rPr>
         <w:drawing>
           <wp:inline distT="0" distB="0" distL="0" distR="0" wp14:anchorId="53296C0A" wp14:editId="695005E2">
             <wp:extent cx="5731510" cy="3027045"/>
@@ -151,20 +219,34 @@
     <w:p>
       <w:pPr>
         <w:rPr>
-          <w:b/>
-          <w:bCs/>
-        </w:rPr>
-      </w:pPr>
-      <w:r>
-        <w:rPr>
-          <w:b/>
-          <w:bCs/>
+          <w:rFonts w:ascii="Times New Roman" w:hAnsi="Times New Roman" w:cs="Times New Roman"/>
+          <w:b/>
+          <w:bCs/>
+          <w:sz w:val="28"/>
+          <w:szCs w:val="28"/>
+        </w:rPr>
+      </w:pPr>
+      <w:r>
+        <w:rPr>
+          <w:rFonts w:ascii="Times New Roman" w:hAnsi="Times New Roman" w:cs="Times New Roman"/>
+          <w:b/>
+          <w:bCs/>
+          <w:sz w:val="28"/>
+          <w:szCs w:val="28"/>
         </w:rPr>
         <w:t>2. Role Creation</w:t>
       </w:r>
     </w:p>
     <w:p>
-      <w:r>
+      <w:pPr>
+        <w:rPr>
+          <w:rFonts w:ascii="Times New Roman" w:hAnsi="Times New Roman" w:cs="Times New Roman"/>
+        </w:rPr>
+      </w:pPr>
+      <w:r>
+        <w:rPr>
+          <w:rFonts w:ascii="Times New Roman" w:hAnsi="Times New Roman" w:cs="Times New Roman"/>
+        </w:rPr>
         <w:t>The following custom roles were created:</w:t>
       </w:r>
     </w:p>
@@ -174,8 +256,14 @@
           <w:ilvl w:val="0"/>
           <w:numId w:val="1"/>
         </w:numPr>
-      </w:pPr>
-      <w:r>
+        <w:rPr>
+          <w:rFonts w:ascii="Times New Roman" w:hAnsi="Times New Roman" w:cs="Times New Roman"/>
+        </w:rPr>
+      </w:pPr>
+      <w:r>
+        <w:rPr>
+          <w:rFonts w:ascii="Times New Roman" w:hAnsi="Times New Roman" w:cs="Times New Roman"/>
+        </w:rPr>
         <w:t>bb1</w:t>
       </w:r>
     </w:p>
@@ -185,8 +273,14 @@
           <w:ilvl w:val="0"/>
           <w:numId w:val="1"/>
         </w:numPr>
-      </w:pPr>
-      <w:r>
+        <w:rPr>
+          <w:rFonts w:ascii="Times New Roman" w:hAnsi="Times New Roman" w:cs="Times New Roman"/>
+        </w:rPr>
+      </w:pPr>
+      <w:r>
+        <w:rPr>
+          <w:rFonts w:ascii="Times New Roman" w:hAnsi="Times New Roman" w:cs="Times New Roman"/>
+        </w:rPr>
         <w:t>bb2</w:t>
       </w:r>
     </w:p>
@@ -196,8 +290,14 @@
           <w:ilvl w:val="0"/>
           <w:numId w:val="1"/>
         </w:numPr>
-      </w:pPr>
-      <w:r>
+        <w:rPr>
+          <w:rFonts w:ascii="Times New Roman" w:hAnsi="Times New Roman" w:cs="Times New Roman"/>
+        </w:rPr>
+      </w:pPr>
+      <w:r>
+        <w:rPr>
+          <w:rFonts w:ascii="Times New Roman" w:hAnsi="Times New Roman" w:cs="Times New Roman"/>
+        </w:rPr>
         <w:t>bb3</w:t>
       </w:r>
     </w:p>
@@ -207,18 +307,41 @@
           <w:ilvl w:val="0"/>
           <w:numId w:val="1"/>
         </w:numPr>
-      </w:pPr>
-      <w:r>
+        <w:rPr>
+          <w:rFonts w:ascii="Times New Roman" w:hAnsi="Times New Roman" w:cs="Times New Roman"/>
+        </w:rPr>
+      </w:pPr>
+      <w:r>
+        <w:rPr>
+          <w:rFonts w:ascii="Times New Roman" w:hAnsi="Times New Roman" w:cs="Times New Roman"/>
+        </w:rPr>
         <w:t>bb4</w:t>
       </w:r>
     </w:p>
     <w:p>
-      <w:r>
+      <w:pPr>
+        <w:rPr>
+          <w:rFonts w:ascii="Times New Roman" w:hAnsi="Times New Roman" w:cs="Times New Roman"/>
+        </w:rPr>
+      </w:pPr>
+      <w:r>
+        <w:rPr>
+          <w:rFonts w:ascii="Times New Roman" w:hAnsi="Times New Roman" w:cs="Times New Roman"/>
+        </w:rPr>
         <w:t>All the roles were assigned to the EEE User.</w:t>
       </w:r>
     </w:p>
     <w:p>
-      <w:r>
+      <w:pPr>
+        <w:rPr>
+          <w:rFonts w:ascii="Times New Roman" w:hAnsi="Times New Roman" w:cs="Times New Roman"/>
+        </w:rPr>
+      </w:pPr>
+      <w:r>
+        <w:rPr>
+          <w:rFonts w:ascii="Times New Roman" w:hAnsi="Times New Roman" w:cs="Times New Roman"/>
+          <w:noProof/>
+        </w:rPr>
         <w:lastRenderedPageBreak/>
         <w:drawing>
           <wp:inline distT="0" distB="0" distL="0" distR="0" wp14:anchorId="3C989AD2" wp14:editId="4D7AA291">
@@ -257,6 +380,10 @@
         </w:drawing>
       </w:r>
       <w:r>
+        <w:rPr>
+          <w:rFonts w:ascii="Times New Roman" w:hAnsi="Times New Roman" w:cs="Times New Roman"/>
+          <w:noProof/>
+        </w:rPr>
         <w:drawing>
           <wp:inline distT="0" distB="0" distL="0" distR="0" wp14:anchorId="176EFB27" wp14:editId="72A3FAF6">
             <wp:extent cx="5731510" cy="3020695"/>
@@ -297,72 +424,145 @@
     <w:p>
       <w:pPr>
         <w:rPr>
-          <w:b/>
-          <w:bCs/>
-        </w:rPr>
-      </w:pPr>
-      <w:r>
-        <w:rPr>
-          <w:b/>
-          <w:bCs/>
+          <w:rFonts w:ascii="Times New Roman" w:hAnsi="Times New Roman" w:cs="Times New Roman"/>
+          <w:b/>
+          <w:bCs/>
+          <w:sz w:val="28"/>
+          <w:szCs w:val="28"/>
+        </w:rPr>
+      </w:pPr>
+      <w:r>
+        <w:rPr>
+          <w:rFonts w:ascii="Times New Roman" w:hAnsi="Times New Roman" w:cs="Times New Roman"/>
+          <w:b/>
+          <w:bCs/>
+          <w:sz w:val="28"/>
+          <w:szCs w:val="28"/>
         </w:rPr>
         <w:t>3. Table Creation</w:t>
       </w:r>
     </w:p>
     <w:p>
-      <w:r>
+      <w:pPr>
+        <w:rPr>
+          <w:rFonts w:ascii="Times New Roman" w:hAnsi="Times New Roman" w:cs="Times New Roman"/>
+        </w:rPr>
+      </w:pPr>
+      <w:r>
+        <w:rPr>
+          <w:rFonts w:ascii="Times New Roman" w:hAnsi="Times New Roman" w:cs="Times New Roman"/>
+        </w:rPr>
         <w:t>A custom table was created.</w:t>
       </w:r>
     </w:p>
     <w:p>
-      <w:r>
-        <w:rPr>
+      <w:pPr>
+        <w:rPr>
+          <w:rFonts w:ascii="Times New Roman" w:hAnsi="Times New Roman" w:cs="Times New Roman"/>
+        </w:rPr>
+      </w:pPr>
+      <w:r>
+        <w:rPr>
+          <w:rFonts w:ascii="Times New Roman" w:hAnsi="Times New Roman" w:cs="Times New Roman"/>
           <w:b/>
           <w:bCs/>
         </w:rPr>
         <w:t>Label:</w:t>
       </w:r>
       <w:r>
+        <w:rPr>
+          <w:rFonts w:ascii="Times New Roman" w:hAnsi="Times New Roman" w:cs="Times New Roman"/>
+        </w:rPr>
         <w:t xml:space="preserve"> Institution Details</w:t>
       </w:r>
       <w:r>
+        <w:rPr>
+          <w:rFonts w:ascii="Times New Roman" w:hAnsi="Times New Roman" w:cs="Times New Roman"/>
+        </w:rPr>
         <w:br/>
       </w:r>
       <w:r>
         <w:rPr>
+          <w:rFonts w:ascii="Times New Roman" w:hAnsi="Times New Roman" w:cs="Times New Roman"/>
           <w:b/>
           <w:bCs/>
         </w:rPr>
         <w:t>Name:</w:t>
       </w:r>
       <w:r>
+        <w:rPr>
+          <w:rFonts w:ascii="Times New Roman" w:hAnsi="Times New Roman" w:cs="Times New Roman"/>
+        </w:rPr>
         <w:t xml:space="preserve"> </w:t>
       </w:r>
       <w:proofErr w:type="spellStart"/>
       <w:r>
+        <w:rPr>
+          <w:rFonts w:ascii="Times New Roman" w:hAnsi="Times New Roman" w:cs="Times New Roman"/>
+        </w:rPr>
         <w:t>u_institution_details</w:t>
       </w:r>
       <w:proofErr w:type="spellEnd"/>
       <w:r>
+        <w:rPr>
+          <w:rFonts w:ascii="Times New Roman" w:hAnsi="Times New Roman" w:cs="Times New Roman"/>
+        </w:rPr>
         <w:br/>
       </w:r>
       <w:r>
         <w:rPr>
+          <w:rFonts w:ascii="Times New Roman" w:hAnsi="Times New Roman" w:cs="Times New Roman"/>
           <w:b/>
           <w:bCs/>
         </w:rPr>
         <w:t>Extends for:</w:t>
       </w:r>
       <w:r>
+        <w:rPr>
+          <w:rFonts w:ascii="Times New Roman" w:hAnsi="Times New Roman" w:cs="Times New Roman"/>
+        </w:rPr>
         <w:t xml:space="preserve"> false</w:t>
       </w:r>
     </w:p>
-    <w:p/>
-    <w:p/>
-    <w:p/>
-    <w:p/>
-    <w:p>
-      <w:r>
+    <w:p>
+      <w:pPr>
+        <w:rPr>
+          <w:rFonts w:ascii="Times New Roman" w:hAnsi="Times New Roman" w:cs="Times New Roman"/>
+        </w:rPr>
+      </w:pPr>
+    </w:p>
+    <w:p>
+      <w:pPr>
+        <w:rPr>
+          <w:rFonts w:ascii="Times New Roman" w:hAnsi="Times New Roman" w:cs="Times New Roman"/>
+        </w:rPr>
+      </w:pPr>
+    </w:p>
+    <w:p>
+      <w:pPr>
+        <w:rPr>
+          <w:rFonts w:ascii="Times New Roman" w:hAnsi="Times New Roman" w:cs="Times New Roman"/>
+        </w:rPr>
+      </w:pPr>
+    </w:p>
+    <w:p>
+      <w:pPr>
+        <w:rPr>
+          <w:rFonts w:ascii="Times New Roman" w:hAnsi="Times New Roman" w:cs="Times New Roman"/>
+        </w:rPr>
+      </w:pPr>
+    </w:p>
+    <w:p>
+      <w:pPr>
+        <w:rPr>
+          <w:rFonts w:ascii="Times New Roman" w:hAnsi="Times New Roman" w:cs="Times New Roman"/>
+        </w:rPr>
+      </w:pPr>
+      <w:r>
+        <w:rPr>
+          <w:rFonts w:ascii="Times New Roman" w:hAnsi="Times New Roman" w:cs="Times New Roman"/>
+          <w:noProof/>
+        </w:rPr>
         <w:lastRenderedPageBreak/>
         <w:drawing>
           <wp:inline distT="0" distB="0" distL="0" distR="0" wp14:anchorId="0BD45FF6" wp14:editId="25004E52">
@@ -404,20 +604,34 @@
     <w:p>
       <w:pPr>
         <w:rPr>
-          <w:b/>
-          <w:bCs/>
-        </w:rPr>
-      </w:pPr>
-      <w:r>
-        <w:rPr>
-          <w:b/>
-          <w:bCs/>
+          <w:rFonts w:ascii="Times New Roman" w:hAnsi="Times New Roman" w:cs="Times New Roman"/>
+          <w:b/>
+          <w:bCs/>
+          <w:sz w:val="28"/>
+          <w:szCs w:val="28"/>
+        </w:rPr>
+      </w:pPr>
+      <w:r>
+        <w:rPr>
+          <w:rFonts w:ascii="Times New Roman" w:hAnsi="Times New Roman" w:cs="Times New Roman"/>
+          <w:b/>
+          <w:bCs/>
+          <w:sz w:val="28"/>
+          <w:szCs w:val="28"/>
         </w:rPr>
         <w:t>4. Fields Created</w:t>
       </w:r>
     </w:p>
     <w:p>
-      <w:r>
+      <w:pPr>
+        <w:rPr>
+          <w:rFonts w:ascii="Times New Roman" w:hAnsi="Times New Roman" w:cs="Times New Roman"/>
+        </w:rPr>
+      </w:pPr>
+      <w:r>
+        <w:rPr>
+          <w:rFonts w:ascii="Times New Roman" w:hAnsi="Times New Roman" w:cs="Times New Roman"/>
+        </w:rPr>
         <w:t>The following fields were added:</w:t>
       </w:r>
     </w:p>
@@ -427,8 +641,14 @@
           <w:ilvl w:val="0"/>
           <w:numId w:val="2"/>
         </w:numPr>
-      </w:pPr>
-      <w:r>
+        <w:rPr>
+          <w:rFonts w:ascii="Times New Roman" w:hAnsi="Times New Roman" w:cs="Times New Roman"/>
+        </w:rPr>
+      </w:pPr>
+      <w:r>
+        <w:rPr>
+          <w:rFonts w:ascii="Times New Roman" w:hAnsi="Times New Roman" w:cs="Times New Roman"/>
+        </w:rPr>
         <w:t>Student Roll Number – Auto Number</w:t>
       </w:r>
     </w:p>
@@ -438,8 +658,14 @@
           <w:ilvl w:val="0"/>
           <w:numId w:val="2"/>
         </w:numPr>
-      </w:pPr>
-      <w:r>
+        <w:rPr>
+          <w:rFonts w:ascii="Times New Roman" w:hAnsi="Times New Roman" w:cs="Times New Roman"/>
+        </w:rPr>
+      </w:pPr>
+      <w:r>
+        <w:rPr>
+          <w:rFonts w:ascii="Times New Roman" w:hAnsi="Times New Roman" w:cs="Times New Roman"/>
+        </w:rPr>
         <w:t>Student Name – Reference - User</w:t>
       </w:r>
     </w:p>
@@ -449,8 +675,14 @@
           <w:ilvl w:val="0"/>
           <w:numId w:val="2"/>
         </w:numPr>
-      </w:pPr>
-      <w:r>
+        <w:rPr>
+          <w:rFonts w:ascii="Times New Roman" w:hAnsi="Times New Roman" w:cs="Times New Roman"/>
+        </w:rPr>
+      </w:pPr>
+      <w:r>
+        <w:rPr>
+          <w:rFonts w:ascii="Times New Roman" w:hAnsi="Times New Roman" w:cs="Times New Roman"/>
+        </w:rPr>
         <w:t>Faculty Name – Reference - User</w:t>
       </w:r>
     </w:p>
@@ -460,8 +692,14 @@
           <w:ilvl w:val="0"/>
           <w:numId w:val="2"/>
         </w:numPr>
-      </w:pPr>
-      <w:r>
+        <w:rPr>
+          <w:rFonts w:ascii="Times New Roman" w:hAnsi="Times New Roman" w:cs="Times New Roman"/>
+        </w:rPr>
+      </w:pPr>
+      <w:r>
+        <w:rPr>
+          <w:rFonts w:ascii="Times New Roman" w:hAnsi="Times New Roman" w:cs="Times New Roman"/>
+        </w:rPr>
         <w:t>Branch – Choice</w:t>
       </w:r>
     </w:p>
@@ -471,8 +709,14 @@
           <w:ilvl w:val="0"/>
           <w:numId w:val="2"/>
         </w:numPr>
-      </w:pPr>
-      <w:r>
+        <w:rPr>
+          <w:rFonts w:ascii="Times New Roman" w:hAnsi="Times New Roman" w:cs="Times New Roman"/>
+        </w:rPr>
+      </w:pPr>
+      <w:r>
+        <w:rPr>
+          <w:rFonts w:ascii="Times New Roman" w:hAnsi="Times New Roman" w:cs="Times New Roman"/>
+        </w:rPr>
         <w:t>Email – String</w:t>
       </w:r>
     </w:p>
@@ -482,8 +726,14 @@
           <w:ilvl w:val="0"/>
           <w:numId w:val="2"/>
         </w:numPr>
-      </w:pPr>
-      <w:r>
+        <w:rPr>
+          <w:rFonts w:ascii="Times New Roman" w:hAnsi="Times New Roman" w:cs="Times New Roman"/>
+        </w:rPr>
+      </w:pPr>
+      <w:r>
+        <w:rPr>
+          <w:rFonts w:ascii="Times New Roman" w:hAnsi="Times New Roman" w:cs="Times New Roman"/>
+        </w:rPr>
         <w:t>Phone Number – String</w:t>
       </w:r>
     </w:p>
@@ -493,16 +743,29 @@
           <w:ilvl w:val="0"/>
           <w:numId w:val="2"/>
         </w:numPr>
-      </w:pPr>
-      <w:r>
+        <w:rPr>
+          <w:rFonts w:ascii="Times New Roman" w:hAnsi="Times New Roman" w:cs="Times New Roman"/>
+        </w:rPr>
+      </w:pPr>
+      <w:r>
+        <w:rPr>
+          <w:rFonts w:ascii="Times New Roman" w:hAnsi="Times New Roman" w:cs="Times New Roman"/>
+        </w:rPr>
         <w:t>Description – Multi String</w:t>
       </w:r>
     </w:p>
     <w:p>
       <w:pPr>
         <w:ind w:left="720"/>
-      </w:pPr>
-      <w:r>
+        <w:rPr>
+          <w:rFonts w:ascii="Times New Roman" w:hAnsi="Times New Roman" w:cs="Times New Roman"/>
+        </w:rPr>
+      </w:pPr>
+      <w:r>
+        <w:rPr>
+          <w:rFonts w:ascii="Times New Roman" w:hAnsi="Times New Roman" w:cs="Times New Roman"/>
+          <w:noProof/>
+        </w:rPr>
         <w:lastRenderedPageBreak/>
         <w:drawing>
           <wp:inline distT="0" distB="0" distL="0" distR="0" wp14:anchorId="3F9E620B" wp14:editId="31ECB4D6">
@@ -542,7 +805,15 @@
       </w:r>
     </w:p>
     <w:p>
-      <w:r>
+      <w:pPr>
+        <w:rPr>
+          <w:rFonts w:ascii="Times New Roman" w:hAnsi="Times New Roman" w:cs="Times New Roman"/>
+        </w:rPr>
+      </w:pPr>
+      <w:r>
+        <w:rPr>
+          <w:rFonts w:ascii="Times New Roman" w:hAnsi="Times New Roman" w:cs="Times New Roman"/>
+        </w:rPr>
         <w:t>The Branch choices are:</w:t>
       </w:r>
     </w:p>
@@ -552,8 +823,14 @@
           <w:ilvl w:val="0"/>
           <w:numId w:val="3"/>
         </w:numPr>
-      </w:pPr>
-      <w:r>
+        <w:rPr>
+          <w:rFonts w:ascii="Times New Roman" w:hAnsi="Times New Roman" w:cs="Times New Roman"/>
+        </w:rPr>
+      </w:pPr>
+      <w:r>
+        <w:rPr>
+          <w:rFonts w:ascii="Times New Roman" w:hAnsi="Times New Roman" w:cs="Times New Roman"/>
+        </w:rPr>
         <w:t>ECE</w:t>
       </w:r>
     </w:p>
@@ -563,8 +840,14 @@
           <w:ilvl w:val="0"/>
           <w:numId w:val="3"/>
         </w:numPr>
-      </w:pPr>
-      <w:r>
+        <w:rPr>
+          <w:rFonts w:ascii="Times New Roman" w:hAnsi="Times New Roman" w:cs="Times New Roman"/>
+        </w:rPr>
+      </w:pPr>
+      <w:r>
+        <w:rPr>
+          <w:rFonts w:ascii="Times New Roman" w:hAnsi="Times New Roman" w:cs="Times New Roman"/>
+        </w:rPr>
         <w:t>EEE</w:t>
       </w:r>
     </w:p>
@@ -574,16 +857,29 @@
           <w:ilvl w:val="0"/>
           <w:numId w:val="3"/>
         </w:numPr>
-      </w:pPr>
-      <w:r>
+        <w:rPr>
+          <w:rFonts w:ascii="Times New Roman" w:hAnsi="Times New Roman" w:cs="Times New Roman"/>
+        </w:rPr>
+      </w:pPr>
+      <w:r>
+        <w:rPr>
+          <w:rFonts w:ascii="Times New Roman" w:hAnsi="Times New Roman" w:cs="Times New Roman"/>
+        </w:rPr>
         <w:t>CSE</w:t>
       </w:r>
     </w:p>
     <w:p>
       <w:pPr>
         <w:ind w:left="720"/>
-      </w:pPr>
-      <w:r>
+        <w:rPr>
+          <w:rFonts w:ascii="Times New Roman" w:hAnsi="Times New Roman" w:cs="Times New Roman"/>
+        </w:rPr>
+      </w:pPr>
+      <w:r>
+        <w:rPr>
+          <w:rFonts w:ascii="Times New Roman" w:hAnsi="Times New Roman" w:cs="Times New Roman"/>
+          <w:noProof/>
+        </w:rPr>
         <w:drawing>
           <wp:inline distT="0" distB="0" distL="0" distR="0" wp14:anchorId="1F07BAA6" wp14:editId="790DFD70">
             <wp:extent cx="5731510" cy="3020695"/>
@@ -624,8 +920,15 @@
     <w:p>
       <w:pPr>
         <w:ind w:left="720"/>
-      </w:pPr>
-      <w:r>
+        <w:rPr>
+          <w:rFonts w:ascii="Times New Roman" w:hAnsi="Times New Roman" w:cs="Times New Roman"/>
+        </w:rPr>
+      </w:pPr>
+      <w:r>
+        <w:rPr>
+          <w:rFonts w:ascii="Times New Roman" w:hAnsi="Times New Roman" w:cs="Times New Roman"/>
+          <w:noProof/>
+        </w:rPr>
         <w:lastRenderedPageBreak/>
         <w:drawing>
           <wp:inline distT="0" distB="0" distL="0" distR="0" wp14:anchorId="3DCF14CA" wp14:editId="6C6CB465">
@@ -667,20 +970,34 @@
     <w:p>
       <w:pPr>
         <w:rPr>
-          <w:b/>
-          <w:bCs/>
-        </w:rPr>
-      </w:pPr>
-      <w:r>
-        <w:rPr>
-          <w:b/>
-          <w:bCs/>
+          <w:rFonts w:ascii="Times New Roman" w:hAnsi="Times New Roman" w:cs="Times New Roman"/>
+          <w:b/>
+          <w:bCs/>
+          <w:sz w:val="28"/>
+          <w:szCs w:val="28"/>
+        </w:rPr>
+      </w:pPr>
+      <w:r>
+        <w:rPr>
+          <w:rFonts w:ascii="Times New Roman" w:hAnsi="Times New Roman" w:cs="Times New Roman"/>
+          <w:b/>
+          <w:bCs/>
+          <w:sz w:val="28"/>
+          <w:szCs w:val="28"/>
         </w:rPr>
         <w:t>5. Record Creation</w:t>
       </w:r>
     </w:p>
     <w:p>
-      <w:r>
+      <w:pPr>
+        <w:rPr>
+          <w:rFonts w:ascii="Times New Roman" w:hAnsi="Times New Roman" w:cs="Times New Roman"/>
+        </w:rPr>
+      </w:pPr>
+      <w:r>
+        <w:rPr>
+          <w:rFonts w:ascii="Times New Roman" w:hAnsi="Times New Roman" w:cs="Times New Roman"/>
+        </w:rPr>
         <w:t>Multiple records were created with different branch values including:</w:t>
       </w:r>
     </w:p>
@@ -690,8 +1007,14 @@
           <w:ilvl w:val="0"/>
           <w:numId w:val="4"/>
         </w:numPr>
-      </w:pPr>
-      <w:r>
+        <w:rPr>
+          <w:rFonts w:ascii="Times New Roman" w:hAnsi="Times New Roman" w:cs="Times New Roman"/>
+        </w:rPr>
+      </w:pPr>
+      <w:r>
+        <w:rPr>
+          <w:rFonts w:ascii="Times New Roman" w:hAnsi="Times New Roman" w:cs="Times New Roman"/>
+        </w:rPr>
         <w:t>ECE</w:t>
       </w:r>
     </w:p>
@@ -701,8 +1024,14 @@
           <w:ilvl w:val="0"/>
           <w:numId w:val="4"/>
         </w:numPr>
-      </w:pPr>
-      <w:r>
+        <w:rPr>
+          <w:rFonts w:ascii="Times New Roman" w:hAnsi="Times New Roman" w:cs="Times New Roman"/>
+        </w:rPr>
+      </w:pPr>
+      <w:r>
+        <w:rPr>
+          <w:rFonts w:ascii="Times New Roman" w:hAnsi="Times New Roman" w:cs="Times New Roman"/>
+        </w:rPr>
         <w:t>EEE</w:t>
       </w:r>
     </w:p>
@@ -712,16 +1041,29 @@
           <w:ilvl w:val="0"/>
           <w:numId w:val="4"/>
         </w:numPr>
-      </w:pPr>
-      <w:r>
+        <w:rPr>
+          <w:rFonts w:ascii="Times New Roman" w:hAnsi="Times New Roman" w:cs="Times New Roman"/>
+        </w:rPr>
+      </w:pPr>
+      <w:r>
+        <w:rPr>
+          <w:rFonts w:ascii="Times New Roman" w:hAnsi="Times New Roman" w:cs="Times New Roman"/>
+        </w:rPr>
         <w:t>CSE</w:t>
       </w:r>
     </w:p>
     <w:p>
       <w:pPr>
         <w:ind w:left="720"/>
-      </w:pPr>
-      <w:r>
+        <w:rPr>
+          <w:rFonts w:ascii="Times New Roman" w:hAnsi="Times New Roman" w:cs="Times New Roman"/>
+        </w:rPr>
+      </w:pPr>
+      <w:r>
+        <w:rPr>
+          <w:rFonts w:ascii="Times New Roman" w:hAnsi="Times New Roman" w:cs="Times New Roman"/>
+          <w:noProof/>
+        </w:rPr>
         <w:drawing>
           <wp:inline distT="0" distB="0" distL="0" distR="0" wp14:anchorId="14B2FF5D" wp14:editId="4D802681">
             <wp:extent cx="5731510" cy="3020695"/>
@@ -762,8 +1104,15 @@
     <w:p>
       <w:pPr>
         <w:ind w:left="720"/>
-      </w:pPr>
-      <w:r>
+        <w:rPr>
+          <w:rFonts w:ascii="Times New Roman" w:hAnsi="Times New Roman" w:cs="Times New Roman"/>
+        </w:rPr>
+      </w:pPr>
+      <w:r>
+        <w:rPr>
+          <w:rFonts w:ascii="Times New Roman" w:hAnsi="Times New Roman" w:cs="Times New Roman"/>
+          <w:noProof/>
+        </w:rPr>
         <w:lastRenderedPageBreak/>
         <w:drawing>
           <wp:inline distT="0" distB="0" distL="0" distR="0" wp14:anchorId="17B9AFEE" wp14:editId="34451482">
@@ -805,8 +1154,15 @@
     <w:p>
       <w:pPr>
         <w:ind w:left="720"/>
-      </w:pPr>
-      <w:r>
+        <w:rPr>
+          <w:rFonts w:ascii="Times New Roman" w:hAnsi="Times New Roman" w:cs="Times New Roman"/>
+        </w:rPr>
+      </w:pPr>
+      <w:r>
+        <w:rPr>
+          <w:rFonts w:ascii="Times New Roman" w:hAnsi="Times New Roman" w:cs="Times New Roman"/>
+          <w:noProof/>
+        </w:rPr>
         <w:drawing>
           <wp:inline distT="0" distB="0" distL="0" distR="0" wp14:anchorId="0A85609B" wp14:editId="1B90B5A5">
             <wp:extent cx="5731510" cy="3020695"/>
@@ -847,8 +1203,15 @@
     <w:p>
       <w:pPr>
         <w:ind w:left="720"/>
-      </w:pPr>
-      <w:r>
+        <w:rPr>
+          <w:rFonts w:ascii="Times New Roman" w:hAnsi="Times New Roman" w:cs="Times New Roman"/>
+        </w:rPr>
+      </w:pPr>
+      <w:r>
+        <w:rPr>
+          <w:rFonts w:ascii="Times New Roman" w:hAnsi="Times New Roman" w:cs="Times New Roman"/>
+          <w:noProof/>
+        </w:rPr>
         <w:lastRenderedPageBreak/>
         <w:drawing>
           <wp:inline distT="0" distB="0" distL="0" distR="0" wp14:anchorId="1E28E80A" wp14:editId="40C3FDDB">
@@ -890,132 +1253,205 @@
     <w:p>
       <w:pPr>
         <w:ind w:left="720"/>
-      </w:pPr>
-    </w:p>
-    <w:p>
-      <w:pPr>
-        <w:rPr>
-          <w:b/>
-          <w:bCs/>
-        </w:rPr>
-      </w:pPr>
-      <w:r>
-        <w:rPr>
-          <w:b/>
-          <w:bCs/>
+        <w:rPr>
+          <w:rFonts w:ascii="Times New Roman" w:hAnsi="Times New Roman" w:cs="Times New Roman"/>
+        </w:rPr>
+      </w:pPr>
+    </w:p>
+    <w:p>
+      <w:pPr>
+        <w:rPr>
+          <w:rFonts w:ascii="Times New Roman" w:hAnsi="Times New Roman" w:cs="Times New Roman"/>
+          <w:b/>
+          <w:bCs/>
+          <w:sz w:val="28"/>
+          <w:szCs w:val="28"/>
+        </w:rPr>
+      </w:pPr>
+      <w:r>
+        <w:rPr>
+          <w:rFonts w:ascii="Times New Roman" w:hAnsi="Times New Roman" w:cs="Times New Roman"/>
+          <w:b/>
+          <w:bCs/>
+          <w:sz w:val="28"/>
+          <w:szCs w:val="28"/>
         </w:rPr>
         <w:t>6. READ ACL Development</w:t>
       </w:r>
     </w:p>
     <w:p>
-      <w:r>
+      <w:pPr>
+        <w:rPr>
+          <w:rFonts w:ascii="Times New Roman" w:hAnsi="Times New Roman" w:cs="Times New Roman"/>
+        </w:rPr>
+      </w:pPr>
+      <w:r>
+        <w:rPr>
+          <w:rFonts w:ascii="Times New Roman" w:hAnsi="Times New Roman" w:cs="Times New Roman"/>
+        </w:rPr>
         <w:t>The READ ACL was configured with:</w:t>
       </w:r>
     </w:p>
     <w:p>
-      <w:r>
-        <w:rPr>
+      <w:pPr>
+        <w:rPr>
+          <w:rFonts w:ascii="Times New Roman" w:hAnsi="Times New Roman" w:cs="Times New Roman"/>
+        </w:rPr>
+      </w:pPr>
+      <w:r>
+        <w:rPr>
+          <w:rFonts w:ascii="Times New Roman" w:hAnsi="Times New Roman" w:cs="Times New Roman"/>
           <w:b/>
           <w:bCs/>
         </w:rPr>
         <w:t>Type:</w:t>
       </w:r>
       <w:r>
+        <w:rPr>
+          <w:rFonts w:ascii="Times New Roman" w:hAnsi="Times New Roman" w:cs="Times New Roman"/>
+        </w:rPr>
         <w:t xml:space="preserve"> record</w:t>
       </w:r>
       <w:r>
+        <w:rPr>
+          <w:rFonts w:ascii="Times New Roman" w:hAnsi="Times New Roman" w:cs="Times New Roman"/>
+        </w:rPr>
         <w:br/>
       </w:r>
       <w:r>
         <w:rPr>
+          <w:rFonts w:ascii="Times New Roman" w:hAnsi="Times New Roman" w:cs="Times New Roman"/>
           <w:b/>
           <w:bCs/>
         </w:rPr>
         <w:t>Operation:</w:t>
       </w:r>
       <w:r>
+        <w:rPr>
+          <w:rFonts w:ascii="Times New Roman" w:hAnsi="Times New Roman" w:cs="Times New Roman"/>
+        </w:rPr>
         <w:t xml:space="preserve"> read</w:t>
       </w:r>
       <w:r>
+        <w:rPr>
+          <w:rFonts w:ascii="Times New Roman" w:hAnsi="Times New Roman" w:cs="Times New Roman"/>
+        </w:rPr>
         <w:br/>
       </w:r>
       <w:r>
         <w:rPr>
+          <w:rFonts w:ascii="Times New Roman" w:hAnsi="Times New Roman" w:cs="Times New Roman"/>
           <w:b/>
           <w:bCs/>
         </w:rPr>
         <w:t>Name:</w:t>
       </w:r>
       <w:r>
+        <w:rPr>
+          <w:rFonts w:ascii="Times New Roman" w:hAnsi="Times New Roman" w:cs="Times New Roman"/>
+        </w:rPr>
         <w:t xml:space="preserve"> </w:t>
       </w:r>
       <w:proofErr w:type="spellStart"/>
       <w:r>
+        <w:rPr>
+          <w:rFonts w:ascii="Times New Roman" w:hAnsi="Times New Roman" w:cs="Times New Roman"/>
+        </w:rPr>
         <w:t>u_institution_details</w:t>
       </w:r>
       <w:proofErr w:type="spellEnd"/>
       <w:r>
+        <w:rPr>
+          <w:rFonts w:ascii="Times New Roman" w:hAnsi="Times New Roman" w:cs="Times New Roman"/>
+        </w:rPr>
         <w:br/>
       </w:r>
       <w:r>
         <w:rPr>
+          <w:rFonts w:ascii="Times New Roman" w:hAnsi="Times New Roman" w:cs="Times New Roman"/>
           <w:b/>
           <w:bCs/>
         </w:rPr>
         <w:t>Active:</w:t>
       </w:r>
       <w:r>
+        <w:rPr>
+          <w:rFonts w:ascii="Times New Roman" w:hAnsi="Times New Roman" w:cs="Times New Roman"/>
+        </w:rPr>
         <w:t xml:space="preserve"> true</w:t>
       </w:r>
       <w:r>
+        <w:rPr>
+          <w:rFonts w:ascii="Times New Roman" w:hAnsi="Times New Roman" w:cs="Times New Roman"/>
+        </w:rPr>
         <w:br/>
       </w:r>
       <w:r>
         <w:rPr>
+          <w:rFonts w:ascii="Times New Roman" w:hAnsi="Times New Roman" w:cs="Times New Roman"/>
           <w:b/>
           <w:bCs/>
         </w:rPr>
         <w:t>Advanced:</w:t>
       </w:r>
       <w:r>
+        <w:rPr>
+          <w:rFonts w:ascii="Times New Roman" w:hAnsi="Times New Roman" w:cs="Times New Roman"/>
+        </w:rPr>
         <w:t xml:space="preserve"> true</w:t>
       </w:r>
       <w:r>
+        <w:rPr>
+          <w:rFonts w:ascii="Times New Roman" w:hAnsi="Times New Roman" w:cs="Times New Roman"/>
+        </w:rPr>
         <w:br/>
       </w:r>
       <w:r>
         <w:rPr>
+          <w:rFonts w:ascii="Times New Roman" w:hAnsi="Times New Roman" w:cs="Times New Roman"/>
           <w:b/>
           <w:bCs/>
         </w:rPr>
         <w:t>Requires role:</w:t>
       </w:r>
       <w:r>
+        <w:rPr>
+          <w:rFonts w:ascii="Times New Roman" w:hAnsi="Times New Roman" w:cs="Times New Roman"/>
+        </w:rPr>
         <w:t xml:space="preserve"> bb1</w:t>
       </w:r>
       <w:r>
+        <w:rPr>
+          <w:rFonts w:ascii="Times New Roman" w:hAnsi="Times New Roman" w:cs="Times New Roman"/>
+        </w:rPr>
         <w:br/>
       </w:r>
       <w:r>
         <w:rPr>
+          <w:rFonts w:ascii="Times New Roman" w:hAnsi="Times New Roman" w:cs="Times New Roman"/>
           <w:b/>
           <w:bCs/>
         </w:rPr>
         <w:t>Data condition:</w:t>
       </w:r>
       <w:r>
+        <w:rPr>
+          <w:rFonts w:ascii="Times New Roman" w:hAnsi="Times New Roman" w:cs="Times New Roman"/>
+        </w:rPr>
         <w:t xml:space="preserve"> Branch is EEE</w:t>
       </w:r>
     </w:p>
     <w:p>
       <w:pPr>
         <w:rPr>
-          <w:b/>
-          <w:bCs/>
-        </w:rPr>
-      </w:pPr>
-      <w:r>
-        <w:rPr>
+          <w:rFonts w:ascii="Times New Roman" w:hAnsi="Times New Roman" w:cs="Times New Roman"/>
+          <w:b/>
+          <w:bCs/>
+        </w:rPr>
+      </w:pPr>
+      <w:r>
+        <w:rPr>
+          <w:rFonts w:ascii="Times New Roman" w:hAnsi="Times New Roman" w:cs="Times New Roman"/>
           <w:b/>
           <w:bCs/>
         </w:rPr>
@@ -1023,95 +1459,226 @@
       </w:r>
     </w:p>
     <w:p>
-      <w:r>
+      <w:pPr>
+        <w:rPr>
+          <w:rFonts w:ascii="Times New Roman" w:hAnsi="Times New Roman" w:cs="Times New Roman"/>
+        </w:rPr>
+      </w:pPr>
+      <w:r>
+        <w:rPr>
+          <w:rFonts w:ascii="Times New Roman" w:hAnsi="Times New Roman" w:cs="Times New Roman"/>
+        </w:rPr>
         <w:t>(function () {</w:t>
       </w:r>
     </w:p>
     <w:p>
-      <w:r>
+      <w:pPr>
+        <w:rPr>
+          <w:rFonts w:ascii="Times New Roman" w:hAnsi="Times New Roman" w:cs="Times New Roman"/>
+        </w:rPr>
+      </w:pPr>
+      <w:r>
+        <w:rPr>
+          <w:rFonts w:ascii="Times New Roman" w:hAnsi="Times New Roman" w:cs="Times New Roman"/>
+        </w:rPr>
         <w:t xml:space="preserve">    // Allow admin users full access</w:t>
       </w:r>
     </w:p>
     <w:p>
-      <w:r>
+      <w:pPr>
+        <w:rPr>
+          <w:rFonts w:ascii="Times New Roman" w:hAnsi="Times New Roman" w:cs="Times New Roman"/>
+        </w:rPr>
+      </w:pPr>
+      <w:r>
+        <w:rPr>
+          <w:rFonts w:ascii="Times New Roman" w:hAnsi="Times New Roman" w:cs="Times New Roman"/>
+        </w:rPr>
         <w:t xml:space="preserve">    if (</w:t>
       </w:r>
       <w:proofErr w:type="spellStart"/>
       <w:proofErr w:type="gramStart"/>
       <w:r>
+        <w:rPr>
+          <w:rFonts w:ascii="Times New Roman" w:hAnsi="Times New Roman" w:cs="Times New Roman"/>
+        </w:rPr>
         <w:t>gs.hasRole</w:t>
       </w:r>
       <w:proofErr w:type="spellEnd"/>
       <w:proofErr w:type="gramEnd"/>
       <w:r>
+        <w:rPr>
+          <w:rFonts w:ascii="Times New Roman" w:hAnsi="Times New Roman" w:cs="Times New Roman"/>
+        </w:rPr>
         <w:t>('admin')) {</w:t>
       </w:r>
     </w:p>
     <w:p>
-      <w:r>
+      <w:pPr>
+        <w:rPr>
+          <w:rFonts w:ascii="Times New Roman" w:hAnsi="Times New Roman" w:cs="Times New Roman"/>
+        </w:rPr>
+      </w:pPr>
+      <w:r>
+        <w:rPr>
+          <w:rFonts w:ascii="Times New Roman" w:hAnsi="Times New Roman" w:cs="Times New Roman"/>
+        </w:rPr>
         <w:t xml:space="preserve">        return true;</w:t>
       </w:r>
     </w:p>
     <w:p>
-      <w:r>
+      <w:pPr>
+        <w:rPr>
+          <w:rFonts w:ascii="Times New Roman" w:hAnsi="Times New Roman" w:cs="Times New Roman"/>
+        </w:rPr>
+      </w:pPr>
+      <w:r>
+        <w:rPr>
+          <w:rFonts w:ascii="Times New Roman" w:hAnsi="Times New Roman" w:cs="Times New Roman"/>
+        </w:rPr>
         <w:t xml:space="preserve">    }</w:t>
       </w:r>
     </w:p>
-    <w:p/>
-    <w:p>
-      <w:r>
+    <w:p>
+      <w:pPr>
+        <w:rPr>
+          <w:rFonts w:ascii="Times New Roman" w:hAnsi="Times New Roman" w:cs="Times New Roman"/>
+        </w:rPr>
+      </w:pPr>
+    </w:p>
+    <w:p>
+      <w:pPr>
+        <w:rPr>
+          <w:rFonts w:ascii="Times New Roman" w:hAnsi="Times New Roman" w:cs="Times New Roman"/>
+        </w:rPr>
+      </w:pPr>
+      <w:r>
+        <w:rPr>
+          <w:rFonts w:ascii="Times New Roman" w:hAnsi="Times New Roman" w:cs="Times New Roman"/>
+        </w:rPr>
         <w:t xml:space="preserve">    // Allow only EEE branch users to see EEE records</w:t>
       </w:r>
     </w:p>
     <w:p>
-      <w:r>
+      <w:pPr>
+        <w:rPr>
+          <w:rFonts w:ascii="Times New Roman" w:hAnsi="Times New Roman" w:cs="Times New Roman"/>
+        </w:rPr>
+      </w:pPr>
+      <w:r>
+        <w:rPr>
+          <w:rFonts w:ascii="Times New Roman" w:hAnsi="Times New Roman" w:cs="Times New Roman"/>
+        </w:rPr>
         <w:t xml:space="preserve">    if (</w:t>
       </w:r>
       <w:proofErr w:type="spellStart"/>
       <w:proofErr w:type="gramStart"/>
       <w:r>
+        <w:rPr>
+          <w:rFonts w:ascii="Times New Roman" w:hAnsi="Times New Roman" w:cs="Times New Roman"/>
+        </w:rPr>
         <w:t>gs.hasRole</w:t>
       </w:r>
       <w:proofErr w:type="spellEnd"/>
       <w:proofErr w:type="gramEnd"/>
       <w:r>
+        <w:rPr>
+          <w:rFonts w:ascii="Times New Roman" w:hAnsi="Times New Roman" w:cs="Times New Roman"/>
+        </w:rPr>
         <w:t>('bb1'</w:t>
       </w:r>
       <w:proofErr w:type="gramStart"/>
       <w:r>
+        <w:rPr>
+          <w:rFonts w:ascii="Times New Roman" w:hAnsi="Times New Roman" w:cs="Times New Roman"/>
+        </w:rPr>
         <w:t>)){</w:t>
       </w:r>
       <w:proofErr w:type="gramEnd"/>
     </w:p>
     <w:p>
-      <w:r>
+      <w:pPr>
+        <w:rPr>
+          <w:rFonts w:ascii="Times New Roman" w:hAnsi="Times New Roman" w:cs="Times New Roman"/>
+        </w:rPr>
+      </w:pPr>
+      <w:r>
+        <w:rPr>
+          <w:rFonts w:ascii="Times New Roman" w:hAnsi="Times New Roman" w:cs="Times New Roman"/>
+        </w:rPr>
         <w:t xml:space="preserve">        return true;</w:t>
       </w:r>
     </w:p>
     <w:p>
-      <w:r>
-        <w:lastRenderedPageBreak/>
+      <w:pPr>
+        <w:rPr>
+          <w:rFonts w:ascii="Times New Roman" w:hAnsi="Times New Roman" w:cs="Times New Roman"/>
+        </w:rPr>
+      </w:pPr>
+      <w:r>
+        <w:rPr>
+          <w:rFonts w:ascii="Times New Roman" w:hAnsi="Times New Roman" w:cs="Times New Roman"/>
+        </w:rPr>
         <w:t xml:space="preserve">    }</w:t>
       </w:r>
     </w:p>
-    <w:p/>
-    <w:p>
-      <w:r>
+    <w:p>
+      <w:pPr>
+        <w:rPr>
+          <w:rFonts w:ascii="Times New Roman" w:hAnsi="Times New Roman" w:cs="Times New Roman"/>
+        </w:rPr>
+      </w:pPr>
+    </w:p>
+    <w:p>
+      <w:pPr>
+        <w:rPr>
+          <w:rFonts w:ascii="Times New Roman" w:hAnsi="Times New Roman" w:cs="Times New Roman"/>
+        </w:rPr>
+      </w:pPr>
+      <w:r>
+        <w:rPr>
+          <w:rFonts w:ascii="Times New Roman" w:hAnsi="Times New Roman" w:cs="Times New Roman"/>
+        </w:rPr>
         <w:t xml:space="preserve">    // Deny access for all others</w:t>
       </w:r>
     </w:p>
     <w:p>
-      <w:r>
+      <w:pPr>
+        <w:rPr>
+          <w:rFonts w:ascii="Times New Roman" w:hAnsi="Times New Roman" w:cs="Times New Roman"/>
+        </w:rPr>
+      </w:pPr>
+      <w:r>
+        <w:rPr>
+          <w:rFonts w:ascii="Times New Roman" w:hAnsi="Times New Roman" w:cs="Times New Roman"/>
+        </w:rPr>
         <w:t xml:space="preserve">    return false;</w:t>
       </w:r>
     </w:p>
     <w:p>
-      <w:r>
+      <w:pPr>
+        <w:rPr>
+          <w:rFonts w:ascii="Times New Roman" w:hAnsi="Times New Roman" w:cs="Times New Roman"/>
+        </w:rPr>
+      </w:pPr>
+      <w:r>
+        <w:rPr>
+          <w:rFonts w:ascii="Times New Roman" w:hAnsi="Times New Roman" w:cs="Times New Roman"/>
+        </w:rPr>
         <w:t>})();</w:t>
       </w:r>
     </w:p>
     <w:p>
-      <w:r>
+      <w:pPr>
+        <w:rPr>
+          <w:rFonts w:ascii="Times New Roman" w:hAnsi="Times New Roman" w:cs="Times New Roman"/>
+        </w:rPr>
+      </w:pPr>
+      <w:r>
+        <w:rPr>
+          <w:rFonts w:ascii="Times New Roman" w:hAnsi="Times New Roman" w:cs="Times New Roman"/>
+          <w:noProof/>
+        </w:rPr>
         <w:drawing>
           <wp:inline distT="0" distB="0" distL="0" distR="0" wp14:anchorId="0D7BEBDF" wp14:editId="762F6A39">
             <wp:extent cx="5731510" cy="3020695"/>
@@ -1150,7 +1717,16 @@
       </w:r>
     </w:p>
     <w:p>
-      <w:r>
+      <w:pPr>
+        <w:rPr>
+          <w:rFonts w:ascii="Times New Roman" w:hAnsi="Times New Roman" w:cs="Times New Roman"/>
+        </w:rPr>
+      </w:pPr>
+      <w:r>
+        <w:rPr>
+          <w:rFonts w:ascii="Times New Roman" w:hAnsi="Times New Roman" w:cs="Times New Roman"/>
+          <w:noProof/>
+        </w:rPr>
         <w:drawing>
           <wp:inline distT="0" distB="0" distL="0" distR="0" wp14:anchorId="402EB383" wp14:editId="3613B343">
             <wp:extent cx="5731510" cy="3020695"/>
@@ -1189,7 +1765,16 @@
       </w:r>
     </w:p>
     <w:p>
-      <w:r>
+      <w:pPr>
+        <w:rPr>
+          <w:rFonts w:ascii="Times New Roman" w:hAnsi="Times New Roman" w:cs="Times New Roman"/>
+        </w:rPr>
+      </w:pPr>
+      <w:r>
+        <w:rPr>
+          <w:rFonts w:ascii="Times New Roman" w:hAnsi="Times New Roman" w:cs="Times New Roman"/>
+          <w:noProof/>
+        </w:rPr>
         <w:lastRenderedPageBreak/>
         <w:drawing>
           <wp:inline distT="0" distB="0" distL="0" distR="0" wp14:anchorId="64F3B385" wp14:editId="0170C4DD">
@@ -1231,100 +1816,159 @@
     <w:p>
       <w:pPr>
         <w:rPr>
-          <w:b/>
-          <w:bCs/>
-        </w:rPr>
-      </w:pPr>
-      <w:r>
-        <w:rPr>
-          <w:b/>
-          <w:bCs/>
+          <w:rFonts w:ascii="Times New Roman" w:hAnsi="Times New Roman" w:cs="Times New Roman"/>
+          <w:b/>
+          <w:bCs/>
+          <w:sz w:val="28"/>
+          <w:szCs w:val="28"/>
+        </w:rPr>
+      </w:pPr>
+      <w:r>
+        <w:rPr>
+          <w:rFonts w:ascii="Times New Roman" w:hAnsi="Times New Roman" w:cs="Times New Roman"/>
+          <w:b/>
+          <w:bCs/>
+          <w:sz w:val="28"/>
+          <w:szCs w:val="28"/>
         </w:rPr>
         <w:t>7. CREATE ACL Development</w:t>
       </w:r>
     </w:p>
     <w:p>
-      <w:r>
-        <w:rPr>
+      <w:pPr>
+        <w:rPr>
+          <w:rFonts w:ascii="Times New Roman" w:hAnsi="Times New Roman" w:cs="Times New Roman"/>
+        </w:rPr>
+      </w:pPr>
+      <w:r>
+        <w:rPr>
+          <w:rFonts w:ascii="Times New Roman" w:hAnsi="Times New Roman" w:cs="Times New Roman"/>
           <w:b/>
           <w:bCs/>
         </w:rPr>
         <w:t>Type:</w:t>
       </w:r>
       <w:r>
+        <w:rPr>
+          <w:rFonts w:ascii="Times New Roman" w:hAnsi="Times New Roman" w:cs="Times New Roman"/>
+        </w:rPr>
         <w:t xml:space="preserve"> record</w:t>
       </w:r>
       <w:r>
+        <w:rPr>
+          <w:rFonts w:ascii="Times New Roman" w:hAnsi="Times New Roman" w:cs="Times New Roman"/>
+        </w:rPr>
         <w:br/>
       </w:r>
       <w:r>
         <w:rPr>
+          <w:rFonts w:ascii="Times New Roman" w:hAnsi="Times New Roman" w:cs="Times New Roman"/>
           <w:b/>
           <w:bCs/>
         </w:rPr>
         <w:t>Operation:</w:t>
       </w:r>
       <w:r>
+        <w:rPr>
+          <w:rFonts w:ascii="Times New Roman" w:hAnsi="Times New Roman" w:cs="Times New Roman"/>
+        </w:rPr>
         <w:t xml:space="preserve"> create</w:t>
       </w:r>
       <w:r>
+        <w:rPr>
+          <w:rFonts w:ascii="Times New Roman" w:hAnsi="Times New Roman" w:cs="Times New Roman"/>
+        </w:rPr>
         <w:br/>
       </w:r>
       <w:r>
         <w:rPr>
+          <w:rFonts w:ascii="Times New Roman" w:hAnsi="Times New Roman" w:cs="Times New Roman"/>
           <w:b/>
           <w:bCs/>
         </w:rPr>
         <w:t>Name:</w:t>
       </w:r>
       <w:r>
+        <w:rPr>
+          <w:rFonts w:ascii="Times New Roman" w:hAnsi="Times New Roman" w:cs="Times New Roman"/>
+        </w:rPr>
         <w:t xml:space="preserve"> </w:t>
       </w:r>
       <w:proofErr w:type="spellStart"/>
       <w:r>
+        <w:rPr>
+          <w:rFonts w:ascii="Times New Roman" w:hAnsi="Times New Roman" w:cs="Times New Roman"/>
+        </w:rPr>
         <w:t>u_institution_details</w:t>
       </w:r>
       <w:proofErr w:type="spellEnd"/>
       <w:r>
+        <w:rPr>
+          <w:rFonts w:ascii="Times New Roman" w:hAnsi="Times New Roman" w:cs="Times New Roman"/>
+        </w:rPr>
         <w:br/>
       </w:r>
       <w:r>
         <w:rPr>
+          <w:rFonts w:ascii="Times New Roman" w:hAnsi="Times New Roman" w:cs="Times New Roman"/>
           <w:b/>
           <w:bCs/>
         </w:rPr>
         <w:t>Active:</w:t>
       </w:r>
       <w:r>
+        <w:rPr>
+          <w:rFonts w:ascii="Times New Roman" w:hAnsi="Times New Roman" w:cs="Times New Roman"/>
+        </w:rPr>
         <w:t xml:space="preserve"> true</w:t>
       </w:r>
       <w:r>
+        <w:rPr>
+          <w:rFonts w:ascii="Times New Roman" w:hAnsi="Times New Roman" w:cs="Times New Roman"/>
+        </w:rPr>
         <w:br/>
       </w:r>
       <w:r>
         <w:rPr>
+          <w:rFonts w:ascii="Times New Roman" w:hAnsi="Times New Roman" w:cs="Times New Roman"/>
           <w:b/>
           <w:bCs/>
         </w:rPr>
         <w:t>Requires role:</w:t>
       </w:r>
       <w:r>
+        <w:rPr>
+          <w:rFonts w:ascii="Times New Roman" w:hAnsi="Times New Roman" w:cs="Times New Roman"/>
+        </w:rPr>
         <w:t xml:space="preserve"> bb2</w:t>
       </w:r>
     </w:p>
     <w:p>
-      <w:r>
+      <w:pPr>
+        <w:rPr>
+          <w:rFonts w:ascii="Times New Roman" w:hAnsi="Times New Roman" w:cs="Times New Roman"/>
+        </w:rPr>
+      </w:pPr>
+      <w:r>
+        <w:rPr>
+          <w:rFonts w:ascii="Times New Roman" w:hAnsi="Times New Roman" w:cs="Times New Roman"/>
+        </w:rPr>
         <w:t>No data condition is added.</w:t>
       </w:r>
     </w:p>
     <w:p>
       <w:pPr>
         <w:rPr>
-          <w:b/>
-          <w:bCs/>
-        </w:rPr>
-      </w:pPr>
-      <w:r>
+          <w:rFonts w:ascii="Times New Roman" w:hAnsi="Times New Roman" w:cs="Times New Roman"/>
+          <w:b/>
+          <w:bCs/>
+        </w:rPr>
+      </w:pPr>
+      <w:r>
+        <w:rPr>
+          <w:rFonts w:ascii="Times New Roman" w:hAnsi="Times New Roman" w:cs="Times New Roman"/>
+          <w:noProof/>
+        </w:rPr>
         <w:drawing>
           <wp:inline distT="0" distB="0" distL="0" distR="0" wp14:anchorId="0C57B5EB" wp14:editId="15AEE9DC">
             <wp:extent cx="5731510" cy="3020695"/>
@@ -1365,14 +2009,17 @@
     <w:p>
       <w:pPr>
         <w:rPr>
-          <w:b/>
-          <w:bCs/>
-        </w:rPr>
-      </w:pPr>
-      <w:r>
-        <w:rPr>
-          <w:b/>
-          <w:bCs/>
+          <w:rFonts w:ascii="Times New Roman" w:hAnsi="Times New Roman" w:cs="Times New Roman"/>
+          <w:b/>
+          <w:bCs/>
+        </w:rPr>
+      </w:pPr>
+      <w:r>
+        <w:rPr>
+          <w:rFonts w:ascii="Times New Roman" w:hAnsi="Times New Roman" w:cs="Times New Roman"/>
+          <w:b/>
+          <w:bCs/>
+          <w:noProof/>
         </w:rPr>
         <w:lastRenderedPageBreak/>
         <w:drawing>
@@ -1415,94 +2062,157 @@
     <w:p>
       <w:pPr>
         <w:rPr>
-          <w:b/>
-          <w:bCs/>
-        </w:rPr>
-      </w:pPr>
-      <w:r>
-        <w:rPr>
-          <w:b/>
-          <w:bCs/>
+          <w:rFonts w:ascii="Times New Roman" w:hAnsi="Times New Roman" w:cs="Times New Roman"/>
+          <w:b/>
+          <w:bCs/>
+          <w:sz w:val="28"/>
+          <w:szCs w:val="28"/>
+        </w:rPr>
+      </w:pPr>
+      <w:r>
+        <w:rPr>
+          <w:rFonts w:ascii="Times New Roman" w:hAnsi="Times New Roman" w:cs="Times New Roman"/>
+          <w:b/>
+          <w:bCs/>
+          <w:sz w:val="28"/>
+          <w:szCs w:val="28"/>
         </w:rPr>
         <w:t>8. WRITE ACL Development</w:t>
       </w:r>
     </w:p>
     <w:p>
-      <w:r>
-        <w:rPr>
+      <w:pPr>
+        <w:rPr>
+          <w:rFonts w:ascii="Times New Roman" w:hAnsi="Times New Roman" w:cs="Times New Roman"/>
+        </w:rPr>
+      </w:pPr>
+      <w:r>
+        <w:rPr>
+          <w:rFonts w:ascii="Times New Roman" w:hAnsi="Times New Roman" w:cs="Times New Roman"/>
           <w:b/>
           <w:bCs/>
         </w:rPr>
         <w:t>Type:</w:t>
       </w:r>
       <w:r>
+        <w:rPr>
+          <w:rFonts w:ascii="Times New Roman" w:hAnsi="Times New Roman" w:cs="Times New Roman"/>
+        </w:rPr>
         <w:t xml:space="preserve"> record</w:t>
       </w:r>
       <w:r>
+        <w:rPr>
+          <w:rFonts w:ascii="Times New Roman" w:hAnsi="Times New Roman" w:cs="Times New Roman"/>
+        </w:rPr>
         <w:br/>
       </w:r>
       <w:r>
         <w:rPr>
+          <w:rFonts w:ascii="Times New Roman" w:hAnsi="Times New Roman" w:cs="Times New Roman"/>
           <w:b/>
           <w:bCs/>
         </w:rPr>
         <w:t>Operation:</w:t>
       </w:r>
       <w:r>
+        <w:rPr>
+          <w:rFonts w:ascii="Times New Roman" w:hAnsi="Times New Roman" w:cs="Times New Roman"/>
+        </w:rPr>
         <w:t xml:space="preserve"> Write</w:t>
       </w:r>
       <w:r>
+        <w:rPr>
+          <w:rFonts w:ascii="Times New Roman" w:hAnsi="Times New Roman" w:cs="Times New Roman"/>
+        </w:rPr>
         <w:br/>
       </w:r>
       <w:r>
         <w:rPr>
+          <w:rFonts w:ascii="Times New Roman" w:hAnsi="Times New Roman" w:cs="Times New Roman"/>
           <w:b/>
           <w:bCs/>
         </w:rPr>
         <w:t>Name:</w:t>
       </w:r>
       <w:r>
+        <w:rPr>
+          <w:rFonts w:ascii="Times New Roman" w:hAnsi="Times New Roman" w:cs="Times New Roman"/>
+        </w:rPr>
         <w:t xml:space="preserve"> </w:t>
       </w:r>
       <w:proofErr w:type="spellStart"/>
       <w:r>
+        <w:rPr>
+          <w:rFonts w:ascii="Times New Roman" w:hAnsi="Times New Roman" w:cs="Times New Roman"/>
+        </w:rPr>
         <w:t>u_institution_details</w:t>
       </w:r>
       <w:proofErr w:type="spellEnd"/>
       <w:r>
+        <w:rPr>
+          <w:rFonts w:ascii="Times New Roman" w:hAnsi="Times New Roman" w:cs="Times New Roman"/>
+        </w:rPr>
         <w:br/>
       </w:r>
       <w:r>
         <w:rPr>
+          <w:rFonts w:ascii="Times New Roman" w:hAnsi="Times New Roman" w:cs="Times New Roman"/>
           <w:b/>
           <w:bCs/>
         </w:rPr>
         <w:t>Active:</w:t>
       </w:r>
       <w:r>
+        <w:rPr>
+          <w:rFonts w:ascii="Times New Roman" w:hAnsi="Times New Roman" w:cs="Times New Roman"/>
+        </w:rPr>
         <w:t xml:space="preserve"> true</w:t>
       </w:r>
       <w:r>
+        <w:rPr>
+          <w:rFonts w:ascii="Times New Roman" w:hAnsi="Times New Roman" w:cs="Times New Roman"/>
+        </w:rPr>
         <w:br/>
       </w:r>
       <w:r>
         <w:rPr>
+          <w:rFonts w:ascii="Times New Roman" w:hAnsi="Times New Roman" w:cs="Times New Roman"/>
           <w:b/>
           <w:bCs/>
         </w:rPr>
         <w:t>Requires role:</w:t>
       </w:r>
       <w:r>
+        <w:rPr>
+          <w:rFonts w:ascii="Times New Roman" w:hAnsi="Times New Roman" w:cs="Times New Roman"/>
+        </w:rPr>
         <w:t xml:space="preserve"> bb3</w:t>
       </w:r>
     </w:p>
     <w:p>
-      <w:r>
+      <w:pPr>
+        <w:rPr>
+          <w:rFonts w:ascii="Times New Roman" w:hAnsi="Times New Roman" w:cs="Times New Roman"/>
+        </w:rPr>
+      </w:pPr>
+      <w:r>
+        <w:rPr>
+          <w:rFonts w:ascii="Times New Roman" w:hAnsi="Times New Roman" w:cs="Times New Roman"/>
+        </w:rPr>
         <w:t>No data condition is added.</w:t>
       </w:r>
     </w:p>
     <w:p>
-      <w:r>
+      <w:pPr>
+        <w:rPr>
+          <w:rFonts w:ascii="Times New Roman" w:hAnsi="Times New Roman" w:cs="Times New Roman"/>
+        </w:rPr>
+      </w:pPr>
+      <w:r>
+        <w:rPr>
+          <w:rFonts w:ascii="Times New Roman" w:hAnsi="Times New Roman" w:cs="Times New Roman"/>
+          <w:noProof/>
+        </w:rPr>
         <w:drawing>
           <wp:inline distT="0" distB="0" distL="0" distR="0" wp14:anchorId="48104F64" wp14:editId="1FF5989F">
             <wp:extent cx="5731510" cy="3020695"/>
@@ -1541,7 +2251,16 @@
       </w:r>
     </w:p>
     <w:p>
-      <w:r>
+      <w:pPr>
+        <w:rPr>
+          <w:rFonts w:ascii="Times New Roman" w:hAnsi="Times New Roman" w:cs="Times New Roman"/>
+        </w:rPr>
+      </w:pPr>
+      <w:r>
+        <w:rPr>
+          <w:rFonts w:ascii="Times New Roman" w:hAnsi="Times New Roman" w:cs="Times New Roman"/>
+          <w:noProof/>
+        </w:rPr>
         <w:lastRenderedPageBreak/>
         <w:drawing>
           <wp:inline distT="0" distB="0" distL="0" distR="0" wp14:anchorId="593C4CFA" wp14:editId="6DBB7CA1">
@@ -1583,94 +2302,157 @@
     <w:p>
       <w:pPr>
         <w:rPr>
-          <w:b/>
-          <w:bCs/>
-        </w:rPr>
-      </w:pPr>
-      <w:r>
-        <w:rPr>
-          <w:b/>
-          <w:bCs/>
+          <w:rFonts w:ascii="Times New Roman" w:hAnsi="Times New Roman" w:cs="Times New Roman"/>
+          <w:b/>
+          <w:bCs/>
+          <w:sz w:val="28"/>
+          <w:szCs w:val="28"/>
+        </w:rPr>
+      </w:pPr>
+      <w:r>
+        <w:rPr>
+          <w:rFonts w:ascii="Times New Roman" w:hAnsi="Times New Roman" w:cs="Times New Roman"/>
+          <w:b/>
+          <w:bCs/>
+          <w:sz w:val="28"/>
+          <w:szCs w:val="28"/>
         </w:rPr>
         <w:t>9. DELETE ACL Development</w:t>
       </w:r>
     </w:p>
     <w:p>
-      <w:r>
-        <w:rPr>
+      <w:pPr>
+        <w:rPr>
+          <w:rFonts w:ascii="Times New Roman" w:hAnsi="Times New Roman" w:cs="Times New Roman"/>
+        </w:rPr>
+      </w:pPr>
+      <w:r>
+        <w:rPr>
+          <w:rFonts w:ascii="Times New Roman" w:hAnsi="Times New Roman" w:cs="Times New Roman"/>
           <w:b/>
           <w:bCs/>
         </w:rPr>
         <w:t>Type:</w:t>
       </w:r>
       <w:r>
+        <w:rPr>
+          <w:rFonts w:ascii="Times New Roman" w:hAnsi="Times New Roman" w:cs="Times New Roman"/>
+        </w:rPr>
         <w:t xml:space="preserve"> record</w:t>
       </w:r>
       <w:r>
+        <w:rPr>
+          <w:rFonts w:ascii="Times New Roman" w:hAnsi="Times New Roman" w:cs="Times New Roman"/>
+        </w:rPr>
         <w:br/>
       </w:r>
       <w:r>
         <w:rPr>
+          <w:rFonts w:ascii="Times New Roman" w:hAnsi="Times New Roman" w:cs="Times New Roman"/>
           <w:b/>
           <w:bCs/>
         </w:rPr>
         <w:t>Operation:</w:t>
       </w:r>
       <w:r>
+        <w:rPr>
+          <w:rFonts w:ascii="Times New Roman" w:hAnsi="Times New Roman" w:cs="Times New Roman"/>
+        </w:rPr>
         <w:t xml:space="preserve"> Delete</w:t>
       </w:r>
       <w:r>
+        <w:rPr>
+          <w:rFonts w:ascii="Times New Roman" w:hAnsi="Times New Roman" w:cs="Times New Roman"/>
+        </w:rPr>
         <w:br/>
       </w:r>
       <w:r>
         <w:rPr>
+          <w:rFonts w:ascii="Times New Roman" w:hAnsi="Times New Roman" w:cs="Times New Roman"/>
           <w:b/>
           <w:bCs/>
         </w:rPr>
         <w:t>Name:</w:t>
       </w:r>
       <w:r>
+        <w:rPr>
+          <w:rFonts w:ascii="Times New Roman" w:hAnsi="Times New Roman" w:cs="Times New Roman"/>
+        </w:rPr>
         <w:t xml:space="preserve"> </w:t>
       </w:r>
       <w:proofErr w:type="spellStart"/>
       <w:r>
+        <w:rPr>
+          <w:rFonts w:ascii="Times New Roman" w:hAnsi="Times New Roman" w:cs="Times New Roman"/>
+        </w:rPr>
         <w:t>u_institution_details</w:t>
       </w:r>
       <w:proofErr w:type="spellEnd"/>
       <w:r>
+        <w:rPr>
+          <w:rFonts w:ascii="Times New Roman" w:hAnsi="Times New Roman" w:cs="Times New Roman"/>
+        </w:rPr>
         <w:br/>
       </w:r>
       <w:r>
         <w:rPr>
+          <w:rFonts w:ascii="Times New Roman" w:hAnsi="Times New Roman" w:cs="Times New Roman"/>
           <w:b/>
           <w:bCs/>
         </w:rPr>
         <w:t>Active:</w:t>
       </w:r>
       <w:r>
+        <w:rPr>
+          <w:rFonts w:ascii="Times New Roman" w:hAnsi="Times New Roman" w:cs="Times New Roman"/>
+        </w:rPr>
         <w:t xml:space="preserve"> true</w:t>
       </w:r>
       <w:r>
+        <w:rPr>
+          <w:rFonts w:ascii="Times New Roman" w:hAnsi="Times New Roman" w:cs="Times New Roman"/>
+        </w:rPr>
         <w:br/>
       </w:r>
       <w:r>
         <w:rPr>
+          <w:rFonts w:ascii="Times New Roman" w:hAnsi="Times New Roman" w:cs="Times New Roman"/>
           <w:b/>
           <w:bCs/>
         </w:rPr>
         <w:t>Requires role:</w:t>
       </w:r>
       <w:r>
+        <w:rPr>
+          <w:rFonts w:ascii="Times New Roman" w:hAnsi="Times New Roman" w:cs="Times New Roman"/>
+        </w:rPr>
         <w:t xml:space="preserve"> bb4</w:t>
       </w:r>
     </w:p>
     <w:p>
-      <w:r>
+      <w:pPr>
+        <w:rPr>
+          <w:rFonts w:ascii="Times New Roman" w:hAnsi="Times New Roman" w:cs="Times New Roman"/>
+        </w:rPr>
+      </w:pPr>
+      <w:r>
+        <w:rPr>
+          <w:rFonts w:ascii="Times New Roman" w:hAnsi="Times New Roman" w:cs="Times New Roman"/>
+        </w:rPr>
         <w:t>No data condition is added.</w:t>
       </w:r>
     </w:p>
     <w:p>
-      <w:r>
+      <w:pPr>
+        <w:rPr>
+          <w:rFonts w:ascii="Times New Roman" w:hAnsi="Times New Roman" w:cs="Times New Roman"/>
+        </w:rPr>
+      </w:pPr>
+      <w:r>
+        <w:rPr>
+          <w:rFonts w:ascii="Times New Roman" w:hAnsi="Times New Roman" w:cs="Times New Roman"/>
+          <w:noProof/>
+        </w:rPr>
         <w:drawing>
           <wp:inline distT="0" distB="0" distL="0" distR="0" wp14:anchorId="77C76DA5" wp14:editId="3A0A7214">
             <wp:extent cx="5731510" cy="3020695"/>
@@ -1709,7 +2491,16 @@
       </w:r>
     </w:p>
     <w:p>
-      <w:r>
+      <w:pPr>
+        <w:rPr>
+          <w:rFonts w:ascii="Times New Roman" w:hAnsi="Times New Roman" w:cs="Times New Roman"/>
+        </w:rPr>
+      </w:pPr>
+      <w:r>
+        <w:rPr>
+          <w:rFonts w:ascii="Times New Roman" w:hAnsi="Times New Roman" w:cs="Times New Roman"/>
+          <w:noProof/>
+        </w:rPr>
         <w:lastRenderedPageBreak/>
         <w:drawing>
           <wp:inline distT="0" distB="0" distL="0" distR="0" wp14:anchorId="22F68685" wp14:editId="62F2093B">
@@ -1751,20 +2542,34 @@
     <w:p>
       <w:pPr>
         <w:rPr>
-          <w:b/>
-          <w:bCs/>
-        </w:rPr>
-      </w:pPr>
-      <w:r>
-        <w:rPr>
-          <w:b/>
-          <w:bCs/>
+          <w:rFonts w:ascii="Times New Roman" w:hAnsi="Times New Roman" w:cs="Times New Roman"/>
+          <w:b/>
+          <w:bCs/>
+          <w:sz w:val="28"/>
+          <w:szCs w:val="28"/>
+        </w:rPr>
+      </w:pPr>
+      <w:r>
+        <w:rPr>
+          <w:rFonts w:ascii="Times New Roman" w:hAnsi="Times New Roman" w:cs="Times New Roman"/>
+          <w:b/>
+          <w:bCs/>
+          <w:sz w:val="28"/>
+          <w:szCs w:val="28"/>
         </w:rPr>
         <w:t>10. Development Evidence</w:t>
       </w:r>
     </w:p>
     <w:p>
-      <w:r>
+      <w:pPr>
+        <w:rPr>
+          <w:rFonts w:ascii="Times New Roman" w:hAnsi="Times New Roman" w:cs="Times New Roman"/>
+        </w:rPr>
+      </w:pPr>
+      <w:r>
+        <w:rPr>
+          <w:rFonts w:ascii="Times New Roman" w:hAnsi="Times New Roman" w:cs="Times New Roman"/>
+        </w:rPr>
         <w:t>The following screenshots should be added to this phase folder:</w:t>
       </w:r>
     </w:p>
@@ -1774,8 +2579,14 @@
           <w:ilvl w:val="0"/>
           <w:numId w:val="5"/>
         </w:numPr>
-      </w:pPr>
-      <w:r>
+        <w:rPr>
+          <w:rFonts w:ascii="Times New Roman" w:hAnsi="Times New Roman" w:cs="Times New Roman"/>
+        </w:rPr>
+      </w:pPr>
+      <w:r>
+        <w:rPr>
+          <w:rFonts w:ascii="Times New Roman" w:hAnsi="Times New Roman" w:cs="Times New Roman"/>
+        </w:rPr>
         <w:t>User creation</w:t>
       </w:r>
     </w:p>
@@ -1785,8 +2596,14 @@
           <w:ilvl w:val="0"/>
           <w:numId w:val="5"/>
         </w:numPr>
-      </w:pPr>
-      <w:r>
+        <w:rPr>
+          <w:rFonts w:ascii="Times New Roman" w:hAnsi="Times New Roman" w:cs="Times New Roman"/>
+        </w:rPr>
+      </w:pPr>
+      <w:r>
+        <w:rPr>
+          <w:rFonts w:ascii="Times New Roman" w:hAnsi="Times New Roman" w:cs="Times New Roman"/>
+        </w:rPr>
         <w:t>Role creation</w:t>
       </w:r>
     </w:p>
@@ -1796,8 +2613,14 @@
           <w:ilvl w:val="0"/>
           <w:numId w:val="5"/>
         </w:numPr>
-      </w:pPr>
-      <w:r>
+        <w:rPr>
+          <w:rFonts w:ascii="Times New Roman" w:hAnsi="Times New Roman" w:cs="Times New Roman"/>
+        </w:rPr>
+      </w:pPr>
+      <w:r>
+        <w:rPr>
+          <w:rFonts w:ascii="Times New Roman" w:hAnsi="Times New Roman" w:cs="Times New Roman"/>
+        </w:rPr>
         <w:t>Table creation</w:t>
       </w:r>
     </w:p>
@@ -1807,8 +2630,14 @@
           <w:ilvl w:val="0"/>
           <w:numId w:val="5"/>
         </w:numPr>
-      </w:pPr>
-      <w:r>
+        <w:rPr>
+          <w:rFonts w:ascii="Times New Roman" w:hAnsi="Times New Roman" w:cs="Times New Roman"/>
+        </w:rPr>
+      </w:pPr>
+      <w:r>
+        <w:rPr>
+          <w:rFonts w:ascii="Times New Roman" w:hAnsi="Times New Roman" w:cs="Times New Roman"/>
+        </w:rPr>
         <w:t>Field creation</w:t>
       </w:r>
     </w:p>
@@ -1818,8 +2647,14 @@
           <w:ilvl w:val="0"/>
           <w:numId w:val="5"/>
         </w:numPr>
-      </w:pPr>
-      <w:r>
+        <w:rPr>
+          <w:rFonts w:ascii="Times New Roman" w:hAnsi="Times New Roman" w:cs="Times New Roman"/>
+        </w:rPr>
+      </w:pPr>
+      <w:r>
+        <w:rPr>
+          <w:rFonts w:ascii="Times New Roman" w:hAnsi="Times New Roman" w:cs="Times New Roman"/>
+        </w:rPr>
         <w:t>Record creation</w:t>
       </w:r>
     </w:p>
@@ -1829,8 +2664,14 @@
           <w:ilvl w:val="0"/>
           <w:numId w:val="5"/>
         </w:numPr>
-      </w:pPr>
-      <w:r>
+        <w:rPr>
+          <w:rFonts w:ascii="Times New Roman" w:hAnsi="Times New Roman" w:cs="Times New Roman"/>
+        </w:rPr>
+      </w:pPr>
+      <w:r>
+        <w:rPr>
+          <w:rFonts w:ascii="Times New Roman" w:hAnsi="Times New Roman" w:cs="Times New Roman"/>
+        </w:rPr>
         <w:t>READ ACL</w:t>
       </w:r>
     </w:p>
@@ -1840,8 +2681,14 @@
           <w:ilvl w:val="0"/>
           <w:numId w:val="5"/>
         </w:numPr>
-      </w:pPr>
-      <w:r>
+        <w:rPr>
+          <w:rFonts w:ascii="Times New Roman" w:hAnsi="Times New Roman" w:cs="Times New Roman"/>
+        </w:rPr>
+      </w:pPr>
+      <w:r>
+        <w:rPr>
+          <w:rFonts w:ascii="Times New Roman" w:hAnsi="Times New Roman" w:cs="Times New Roman"/>
+        </w:rPr>
         <w:t>READ ACL script</w:t>
       </w:r>
     </w:p>
@@ -1851,8 +2698,14 @@
           <w:ilvl w:val="0"/>
           <w:numId w:val="5"/>
         </w:numPr>
-      </w:pPr>
-      <w:r>
+        <w:rPr>
+          <w:rFonts w:ascii="Times New Roman" w:hAnsi="Times New Roman" w:cs="Times New Roman"/>
+        </w:rPr>
+      </w:pPr>
+      <w:r>
+        <w:rPr>
+          <w:rFonts w:ascii="Times New Roman" w:hAnsi="Times New Roman" w:cs="Times New Roman"/>
+        </w:rPr>
         <w:t>CREATE ACL</w:t>
       </w:r>
     </w:p>
@@ -1862,8 +2715,14 @@
           <w:ilvl w:val="0"/>
           <w:numId w:val="5"/>
         </w:numPr>
-      </w:pPr>
-      <w:r>
+        <w:rPr>
+          <w:rFonts w:ascii="Times New Roman" w:hAnsi="Times New Roman" w:cs="Times New Roman"/>
+        </w:rPr>
+      </w:pPr>
+      <w:r>
+        <w:rPr>
+          <w:rFonts w:ascii="Times New Roman" w:hAnsi="Times New Roman" w:cs="Times New Roman"/>
+        </w:rPr>
         <w:t>WRITE ACL</w:t>
       </w:r>
     </w:p>
@@ -1873,12 +2732,24 @@
           <w:ilvl w:val="0"/>
           <w:numId w:val="5"/>
         </w:numPr>
-      </w:pPr>
-      <w:r>
+        <w:rPr>
+          <w:rFonts w:ascii="Times New Roman" w:hAnsi="Times New Roman" w:cs="Times New Roman"/>
+        </w:rPr>
+      </w:pPr>
+      <w:r>
+        <w:rPr>
+          <w:rFonts w:ascii="Times New Roman" w:hAnsi="Times New Roman" w:cs="Times New Roman"/>
+        </w:rPr>
         <w:t>DELETE ACL</w:t>
       </w:r>
     </w:p>
-    <w:p/>
+    <w:p>
+      <w:pPr>
+        <w:rPr>
+          <w:rFonts w:ascii="Times New Roman" w:hAnsi="Times New Roman" w:cs="Times New Roman"/>
+        </w:rPr>
+      </w:pPr>
+    </w:p>
     <w:sectPr>
       <w:pgSz w:w="11906" w:h="16838"/>
       <w:pgMar w:top="1440" w:right="1440" w:bottom="1440" w:left="1440" w:header="708" w:footer="708" w:gutter="0"/>

</xml_diff>